<commit_message>
feat: unidad 13 · IA copiloto de estudio — cierra el bloque Estudiar
</commit_message>
<xml_diff>
--- a/docx/12-examen-en-blanco/12-examen-en-blanco.docx
+++ b/docx/12-examen-en-blanco/12-examen-en-blanco.docx
@@ -28,7 +28,7 @@
         </w:p>
       </w:sdtContent>
     </w:sdt>
-    <w:bookmarkStart w:id="17" w:name="examen-en-blanco"/>
+    <w:bookmarkStart w:id="18" w:name="examen-en-blanco"/>
     <w:p>
       <w:pPr>
         <w:pStyle w:val="Heading1"/>
@@ -448,7 +448,7 @@
       </w:r>
     </w:p>
     <w:bookmarkEnd w:id="15"/>
-    <w:bookmarkStart w:id="16" w:name="por-dónde-empiezo"/>
+    <w:bookmarkStart w:id="17" w:name="por-dónde-empiezo"/>
     <w:p>
       <w:pPr>
         <w:pStyle w:val="Heading2"/>
@@ -541,12 +541,26 @@
           <w:b/>
           <w:bCs/>
         </w:rPr>
-        <w:t xml:space="preserve">⏭️ Al acabar la unidad, el siguiente del bloque es IA: copiloto de estudio (en preparación).</w:t>
-      </w:r>
-    </w:p>
-    <w:bookmarkEnd w:id="16"/>
+        <w:t xml:space="preserve">⏭️ Al acabar, continúa con la última del bloque 📚 Estudiar:</w:t>
+      </w:r>
+      <w:r>
+        <w:t xml:space="preserve"> </w:t>
+      </w:r>
+      <w:hyperlink r:id="rId16">
+        <w:r>
+          <w:rPr>
+            <w:rStyle w:val="Hyperlink"/>
+          </w:rPr>
+          <w:t xml:space="preserve">IA: copiloto de estudio</w:t>
+        </w:r>
+      </w:hyperlink>
+      <w:r>
+        <w:t xml:space="preserve">.</w:t>
+      </w:r>
+    </w:p>
     <w:bookmarkEnd w:id="17"/>
-    <w:bookmarkStart w:id="24" w:name="tu-examen-en-blanco"/>
+    <w:bookmarkEnd w:id="18"/>
+    <w:bookmarkStart w:id="25" w:name="tu-examen-en-blanco"/>
     <w:p>
       <w:pPr>
         <w:pStyle w:val="Heading1"/>
@@ -610,7 +624,7 @@
         </w:pict>
       </w:r>
     </w:p>
-    <w:bookmarkStart w:id="18" w:name="en-corto"/>
+    <w:bookmarkStart w:id="19" w:name="en-corto"/>
     <w:p>
       <w:pPr>
         <w:pStyle w:val="Heading2"/>
@@ -660,8 +674,8 @@
         </w:pict>
       </w:r>
     </w:p>
-    <w:bookmarkEnd w:id="18"/>
-    <w:bookmarkStart w:id="19" w:name="lo-que-hay-que-saber"/>
+    <w:bookmarkEnd w:id="19"/>
+    <w:bookmarkStart w:id="20" w:name="lo-que-hay-que-saber"/>
     <w:p>
       <w:pPr>
         <w:pStyle w:val="Heading2"/>
@@ -1203,8 +1217,8 @@
         <w:t xml:space="preserve">📝 Eliges, preguntas, lo haces en blanco, corriges en otro color y anotas lo rojo</w:t>
       </w:r>
     </w:p>
-    <w:bookmarkEnd w:id="19"/>
-    <w:bookmarkStart w:id="20" w:name="a-por-ellos"/>
+    <w:bookmarkEnd w:id="20"/>
+    <w:bookmarkStart w:id="21" w:name="a-por-ellos"/>
     <w:p>
       <w:pPr>
         <w:pStyle w:val="Heading2"/>
@@ -1666,8 +1680,8 @@
         </w:pict>
       </w:r>
     </w:p>
-    <w:bookmarkEnd w:id="20"/>
-    <w:bookmarkStart w:id="21" w:name="X895b14017c0cd2d10a13fa893cd8983b94e210c"/>
+    <w:bookmarkEnd w:id="21"/>
+    <w:bookmarkStart w:id="22" w:name="X895b14017c0cd2d10a13fa893cd8983b94e210c"/>
     <w:p>
       <w:pPr>
         <w:pStyle w:val="Heading2"/>
@@ -1715,8 +1729,8 @@
         </w:pict>
       </w:r>
     </w:p>
-    <w:bookmarkEnd w:id="21"/>
-    <w:bookmarkStart w:id="23" w:name="para-el-profe-soluciones-y-pistas"/>
+    <w:bookmarkEnd w:id="22"/>
+    <w:bookmarkStart w:id="24" w:name="para-el-profe-soluciones-y-pistas"/>
     <w:p>
       <w:pPr>
         <w:pStyle w:val="Heading2"/>
@@ -1782,7 +1796,7 @@
       <w:r>
         <w:t xml:space="preserve"> </w:t>
       </w:r>
-      <w:hyperlink r:id="rId22">
+      <w:hyperlink r:id="rId23">
         <w:r>
           <w:rPr>
             <w:rStyle w:val="Hyperlink"/>
@@ -1809,7 +1823,7 @@
       <w:r>
         <w:t xml:space="preserve"> </w:t>
       </w:r>
-      <w:hyperlink r:id="rId22">
+      <w:hyperlink r:id="rId23">
         <w:r>
           <w:rPr>
             <w:rStyle w:val="Hyperlink"/>
@@ -1845,9 +1859,9 @@
         </w:r>
       </w:hyperlink>
     </w:p>
-    <w:bookmarkEnd w:id="23"/>
     <w:bookmarkEnd w:id="24"/>
-    <w:bookmarkStart w:id="30" w:name="el-día-del-examen-real"/>
+    <w:bookmarkEnd w:id="25"/>
+    <w:bookmarkStart w:id="31" w:name="el-día-del-examen-real"/>
     <w:p>
       <w:pPr>
         <w:pStyle w:val="Heading1"/>
@@ -1911,7 +1925,7 @@
         </w:pict>
       </w:r>
     </w:p>
-    <w:bookmarkStart w:id="25" w:name="en-corto-1"/>
+    <w:bookmarkStart w:id="26" w:name="en-corto-1"/>
     <w:p>
       <w:pPr>
         <w:pStyle w:val="Heading2"/>
@@ -1948,8 +1962,8 @@
         </w:pict>
       </w:r>
     </w:p>
-    <w:bookmarkEnd w:id="25"/>
-    <w:bookmarkStart w:id="26" w:name="lo-que-hay-que-saber-1"/>
+    <w:bookmarkEnd w:id="26"/>
+    <w:bookmarkStart w:id="27" w:name="lo-que-hay-que-saber-1"/>
     <w:p>
       <w:pPr>
         <w:pStyle w:val="Heading2"/>
@@ -2321,8 +2335,8 @@
         <w:t xml:space="preserve">⏱️ Leer · fáciles · difíciles · revisar (el tiempo se reparte al empezar)</w:t>
       </w:r>
     </w:p>
-    <w:bookmarkEnd w:id="26"/>
-    <w:bookmarkStart w:id="27" w:name="a-por-ellos-1"/>
+    <w:bookmarkEnd w:id="27"/>
+    <w:bookmarkStart w:id="28" w:name="a-por-ellos-1"/>
     <w:p>
       <w:pPr>
         <w:pStyle w:val="Heading2"/>
@@ -2586,8 +2600,8 @@
         </w:pict>
       </w:r>
     </w:p>
-    <w:bookmarkEnd w:id="27"/>
-    <w:bookmarkStart w:id="28" w:name="X5169b422469880f59335cba2a072fc86c7bdc8c"/>
+    <w:bookmarkEnd w:id="28"/>
+    <w:bookmarkStart w:id="29" w:name="X5169b422469880f59335cba2a072fc86c7bdc8c"/>
     <w:p>
       <w:pPr>
         <w:pStyle w:val="Heading2"/>
@@ -2661,8 +2675,8 @@
         </w:pict>
       </w:r>
     </w:p>
-    <w:bookmarkEnd w:id="28"/>
-    <w:bookmarkStart w:id="29" w:name="para-el-profe-soluciones-y-pistas-1"/>
+    <w:bookmarkEnd w:id="29"/>
+    <w:bookmarkStart w:id="30" w:name="para-el-profe-soluciones-y-pistas-1"/>
     <w:p>
       <w:pPr>
         <w:pStyle w:val="Heading2"/>
@@ -2737,7 +2751,7 @@
       <w:r>
         <w:t xml:space="preserve"> </w:t>
       </w:r>
-      <w:hyperlink r:id="rId22">
+      <w:hyperlink r:id="rId23">
         <w:r>
           <w:rPr>
             <w:rStyle w:val="Hyperlink"/>
@@ -2800,9 +2814,9 @@
         </w:r>
       </w:hyperlink>
     </w:p>
-    <w:bookmarkEnd w:id="29"/>
     <w:bookmarkEnd w:id="30"/>
-    <w:bookmarkStart w:id="40" w:name="juegos-y-retos"/>
+    <w:bookmarkEnd w:id="31"/>
+    <w:bookmarkStart w:id="41" w:name="juegos-y-retos"/>
     <w:p>
       <w:pPr>
         <w:pStyle w:val="Heading1"/>
@@ -2866,7 +2880,7 @@
         </w:pict>
       </w:r>
     </w:p>
-    <w:bookmarkStart w:id="31" w:name="en-corto-2"/>
+    <w:bookmarkStart w:id="32" w:name="en-corto-2"/>
     <w:p>
       <w:pPr>
         <w:pStyle w:val="Heading2"/>
@@ -2903,8 +2917,8 @@
         </w:pict>
       </w:r>
     </w:p>
-    <w:bookmarkEnd w:id="31"/>
-    <w:bookmarkStart w:id="32" w:name="el-fail-de-dani"/>
+    <w:bookmarkEnd w:id="32"/>
+    <w:bookmarkStart w:id="33" w:name="el-fail-de-dani"/>
     <w:p>
       <w:pPr>
         <w:pStyle w:val="Heading2"/>
@@ -3013,8 +3027,8 @@
         </w:pict>
       </w:r>
     </w:p>
-    <w:bookmarkEnd w:id="32"/>
-    <w:bookmarkStart w:id="33" w:name="juego-1-examen-exprés-15-min"/>
+    <w:bookmarkEnd w:id="33"/>
+    <w:bookmarkStart w:id="34" w:name="juego-1-examen-exprés-15-min"/>
     <w:p>
       <w:pPr>
         <w:pStyle w:val="Heading2"/>
@@ -3163,8 +3177,8 @@
         </w:pict>
       </w:r>
     </w:p>
-    <w:bookmarkEnd w:id="33"/>
-    <w:bookmarkStart w:id="34" w:name="juego-2-el-reparto-perfecto-10-min"/>
+    <w:bookmarkEnd w:id="34"/>
+    <w:bookmarkStart w:id="35" w:name="juego-2-el-reparto-perfecto-10-min"/>
     <w:p>
       <w:pPr>
         <w:pStyle w:val="Heading2"/>
@@ -3217,8 +3231,8 @@
         </w:pict>
       </w:r>
     </w:p>
-    <w:bookmarkEnd w:id="34"/>
-    <w:bookmarkStart w:id="35" w:name="juego-3-la-frase-que-te-salva-5-min"/>
+    <w:bookmarkEnd w:id="35"/>
+    <w:bookmarkStart w:id="36" w:name="juego-3-la-frase-que-te-salva-5-min"/>
     <w:p>
       <w:pPr>
         <w:pStyle w:val="Heading2"/>
@@ -3285,8 +3299,8 @@
         </w:pict>
       </w:r>
     </w:p>
-    <w:bookmarkEnd w:id="35"/>
-    <w:bookmarkStart w:id="36" w:name="logros"/>
+    <w:bookmarkEnd w:id="36"/>
+    <w:bookmarkStart w:id="37" w:name="logros"/>
     <w:p>
       <w:pPr>
         <w:pStyle w:val="Heading2"/>
@@ -3511,8 +3525,8 @@
         </w:pict>
       </w:r>
     </w:p>
-    <w:bookmarkEnd w:id="36"/>
-    <w:bookmarkStart w:id="37" w:name="reto-final"/>
+    <w:bookmarkEnd w:id="37"/>
+    <w:bookmarkStart w:id="38" w:name="reto-final"/>
     <w:p>
       <w:pPr>
         <w:pStyle w:val="Heading2"/>
@@ -3653,8 +3667,8 @@
         </w:pict>
       </w:r>
     </w:p>
-    <w:bookmarkEnd w:id="37"/>
-    <w:bookmarkStart w:id="39" w:name="para-el-profe"/>
+    <w:bookmarkEnd w:id="38"/>
+    <w:bookmarkStart w:id="40" w:name="para-el-profe"/>
     <w:p>
       <w:pPr>
         <w:pStyle w:val="Heading2"/>
@@ -3717,7 +3731,7 @@
       <w:r>
         <w:t xml:space="preserve"> </w:t>
       </w:r>
-      <w:hyperlink r:id="rId22">
+      <w:hyperlink r:id="rId23">
         <w:r>
           <w:rPr>
             <w:rStyle w:val="Hyperlink"/>
@@ -3771,7 +3785,7 @@
       <w:r>
         <w:t xml:space="preserve"> </w:t>
       </w:r>
-      <w:hyperlink r:id="rId38">
+      <w:hyperlink r:id="rId39">
         <w:r>
           <w:rPr>
             <w:rStyle w:val="Hyperlink"/>
@@ -3780,8 +3794,8 @@
         </w:r>
       </w:hyperlink>
     </w:p>
-    <w:bookmarkEnd w:id="39"/>
     <w:bookmarkEnd w:id="40"/>
+    <w:bookmarkEnd w:id="41"/>
     <w:sectPr>
       <w:footnotePr>
         <w:numRestart w:val="eachSect"/>

</xml_diff>